<commit_message>
Add graphical swimlane workflow diagram to probation CR
Co-Authored-By: Claude Opus 5.5 <noreply@anthropic.com>
Claude-Session: https://claude.ai/code/session_01SLkyCeSeV96w3aeCje3oHa
</commit_message>
<xml_diff>
--- a/docs/CR-2026-XXX-PEV/CR-2026-XXX-PEV_CR_v0.1.docx
+++ b/docs/CR-2026-XXX-PEV/CR-2026-XXX-PEV_CR_v0.1.docx
@@ -1058,267 +1058,49 @@
       </w:r>
     </w:p>
     <w:p>
-      <w:pPr>
-        <w:pStyle w:val="NoSpacing"/>
-      </w:pPr>
+      <w:pPr/>
       <w:r>
-        <w:rPr>
-          <w:rFonts w:ascii="Consolas" w:hAnsi="Consolas"/>
-          <w:sz w:val="17"/>
-        </w:rPr>
-        <w:t xml:space="preserve"> Daily job (probation end date - 15 days)</w:t>
+        <w:drawing>
+          <wp:inline xmlns:a="http://schemas.openxmlformats.org/drawingml/2006/main" xmlns:pic="http://schemas.openxmlformats.org/drawingml/2006/picture">
+            <wp:extent cx="5486400" cy="2840019"/>
+            <wp:docPr id="1" name="Picture 1"/>
+            <wp:cNvGraphicFramePr>
+              <a:graphicFrameLocks noChangeAspect="1"/>
+            </wp:cNvGraphicFramePr>
+            <a:graphic>
+              <a:graphicData uri="http://schemas.openxmlformats.org/drawingml/2006/picture">
+                <pic:pic>
+                  <pic:nvPicPr>
+                    <pic:cNvPr id="0" name="CR-2026-XXX-PEV_Workflow.png"/>
+                    <pic:cNvPicPr/>
+                  </pic:nvPicPr>
+                  <pic:blipFill>
+                    <a:blip r:embed="rId13"/>
+                    <a:stretch>
+                      <a:fillRect/>
+                    </a:stretch>
+                  </pic:blipFill>
+                  <pic:spPr>
+                    <a:xfrm>
+                      <a:off x="0" y="0"/>
+                      <a:ext cx="5486400" cy="2840019"/>
+                    </a:xfrm>
+                    <a:prstGeom prst="rect"/>
+                  </pic:spPr>
+                </pic:pic>
+              </a:graphicData>
+            </a:graphic>
+          </wp:inline>
+        </w:drawing>
       </w:r>
     </w:p>
     <w:p>
-      <w:pPr>
-        <w:pStyle w:val="NoSpacing"/>
-      </w:pPr>
+      <w:pPr/>
       <w:r>
         <w:rPr>
-          <w:rFonts w:ascii="Consolas" w:hAnsi="Consolas"/>
-          <w:sz w:val="17"/>
+          <w:i/>
         </w:rPr>
-        <w:t xml:space="preserve">          |</w:t>
-      </w:r>
-    </w:p>
-    <w:p>
-      <w:pPr>
-        <w:pStyle w:val="NoSpacing"/>
-      </w:pPr>
-      <w:r>
-        <w:rPr>
-          <w:rFonts w:ascii="Consolas" w:hAnsi="Consolas"/>
-          <w:sz w:val="17"/>
-        </w:rPr>
-        <w:t xml:space="preserve">          v</w:t>
-      </w:r>
-    </w:p>
-    <w:p>
-      <w:pPr>
-        <w:pStyle w:val="NoSpacing"/>
-      </w:pPr>
-      <w:r>
-        <w:rPr>
-          <w:rFonts w:ascii="Consolas" w:hAnsi="Consolas"/>
-          <w:sz w:val="17"/>
-        </w:rPr>
-        <w:t xml:space="preserve"> [1] Evaluation queue created  -----------------------------&gt;  Status: EVALUATION PENDING</w:t>
-      </w:r>
-    </w:p>
-    <w:p>
-      <w:pPr>
-        <w:pStyle w:val="NoSpacing"/>
-      </w:pPr>
-      <w:r>
-        <w:rPr>
-          <w:rFonts w:ascii="Consolas" w:hAnsi="Consolas"/>
-          <w:sz w:val="17"/>
-        </w:rPr>
-        <w:t xml:space="preserve">     for respective supervisor</w:t>
-      </w:r>
-    </w:p>
-    <w:p>
-      <w:pPr>
-        <w:pStyle w:val="NoSpacing"/>
-      </w:pPr>
-      <w:r>
-        <w:rPr>
-          <w:rFonts w:ascii="Consolas" w:hAnsi="Consolas"/>
-          <w:sz w:val="17"/>
-        </w:rPr>
-        <w:t xml:space="preserve">          |</w:t>
-      </w:r>
-    </w:p>
-    <w:p>
-      <w:pPr>
-        <w:pStyle w:val="NoSpacing"/>
-      </w:pPr>
-      <w:r>
-        <w:rPr>
-          <w:rFonts w:ascii="Consolas" w:hAnsi="Consolas"/>
-          <w:sz w:val="17"/>
-        </w:rPr>
-        <w:t xml:space="preserve">          v</w:t>
-      </w:r>
-    </w:p>
-    <w:p>
-      <w:pPr>
-        <w:pStyle w:val="NoSpacing"/>
-      </w:pPr>
-      <w:r>
-        <w:rPr>
-          <w:rFonts w:ascii="Consolas" w:hAnsi="Consolas"/>
-          <w:sz w:val="17"/>
-        </w:rPr>
-        <w:t xml:space="preserve"> [2] Supervisor fills evaluation</w:t>
-      </w:r>
-    </w:p>
-    <w:p>
-      <w:pPr>
-        <w:pStyle w:val="NoSpacing"/>
-      </w:pPr>
-      <w:r>
-        <w:rPr>
-          <w:rFonts w:ascii="Consolas" w:hAnsi="Consolas"/>
-          <w:sz w:val="17"/>
-        </w:rPr>
-        <w:t xml:space="preserve">          |--- Save as Draft  ---------------------------------&gt; Status: DRAFT (stays with supervisor)</w:t>
-      </w:r>
-    </w:p>
-    <w:p>
-      <w:pPr>
-        <w:pStyle w:val="NoSpacing"/>
-      </w:pPr>
-      <w:r>
-        <w:rPr>
-          <w:rFonts w:ascii="Consolas" w:hAnsi="Consolas"/>
-          <w:sz w:val="17"/>
-        </w:rPr>
-        <w:t xml:space="preserve">          |--- Submit (mandatory fields validated) ------------&gt; Status: PENDING APPROVAL - LEVEL 1</w:t>
-      </w:r>
-    </w:p>
-    <w:p>
-      <w:pPr>
-        <w:pStyle w:val="NoSpacing"/>
-      </w:pPr>
-      <w:r>
-        <w:rPr>
-          <w:rFonts w:ascii="Consolas" w:hAnsi="Consolas"/>
-          <w:sz w:val="17"/>
-        </w:rPr>
-        <w:t xml:space="preserve">          v</w:t>
-      </w:r>
-    </w:p>
-    <w:p>
-      <w:pPr>
-        <w:pStyle w:val="NoSpacing"/>
-      </w:pPr>
-      <w:r>
-        <w:rPr>
-          <w:rFonts w:ascii="Consolas" w:hAnsi="Consolas"/>
-          <w:sz w:val="17"/>
-        </w:rPr>
-        <w:t xml:space="preserve"> [3] Approval hierarchy (Level 1 .. Level n)</w:t>
-      </w:r>
-    </w:p>
-    <w:p>
-      <w:pPr>
-        <w:pStyle w:val="NoSpacing"/>
-      </w:pPr>
-      <w:r>
-        <w:rPr>
-          <w:rFonts w:ascii="Consolas" w:hAnsi="Consolas"/>
-          <w:sz w:val="17"/>
-        </w:rPr>
-        <w:t xml:space="preserve">          |--- Approve -&gt; next level --------------------------&gt; Status: PENDING APPROVAL - LEVEL n</w:t>
-      </w:r>
-    </w:p>
-    <w:p>
-      <w:pPr>
-        <w:pStyle w:val="NoSpacing"/>
-      </w:pPr>
-      <w:r>
-        <w:rPr>
-          <w:rFonts w:ascii="Consolas" w:hAnsi="Consolas"/>
-          <w:sz w:val="17"/>
-        </w:rPr>
-        <w:t xml:space="preserve">          |--- Return with comments -&gt; back to supervisor -----&gt; Status: RETURNED</w:t>
-      </w:r>
-    </w:p>
-    <w:p>
-      <w:pPr>
-        <w:pStyle w:val="NoSpacing"/>
-      </w:pPr>
-      <w:r>
-        <w:rPr>
-          <w:rFonts w:ascii="Consolas" w:hAnsi="Consolas"/>
-          <w:sz w:val="17"/>
-        </w:rPr>
-        <w:t xml:space="preserve">          v</w:t>
-      </w:r>
-    </w:p>
-    <w:p>
-      <w:pPr>
-        <w:pStyle w:val="NoSpacing"/>
-      </w:pPr>
-      <w:r>
-        <w:rPr>
-          <w:rFonts w:ascii="Consolas" w:hAnsi="Consolas"/>
-          <w:sz w:val="17"/>
-        </w:rPr>
-        <w:t xml:space="preserve"> [4] Last level approves -&gt; routed to HR queue ---------------&gt; Status: FORWARDED TO HR</w:t>
-      </w:r>
-    </w:p>
-    <w:p>
-      <w:pPr>
-        <w:pStyle w:val="NoSpacing"/>
-      </w:pPr>
-      <w:r>
-        <w:rPr>
-          <w:rFonts w:ascii="Consolas" w:hAnsi="Consolas"/>
-          <w:sz w:val="17"/>
-        </w:rPr>
-        <w:t xml:space="preserve">          |</w:t>
-      </w:r>
-    </w:p>
-    <w:p>
-      <w:pPr>
-        <w:pStyle w:val="NoSpacing"/>
-      </w:pPr>
-      <w:r>
-        <w:rPr>
-          <w:rFonts w:ascii="Consolas" w:hAnsi="Consolas"/>
-          <w:sz w:val="17"/>
-        </w:rPr>
-        <w:t xml:space="preserve">          v</w:t>
-      </w:r>
-    </w:p>
-    <w:p>
-      <w:pPr>
-        <w:pStyle w:val="NoSpacing"/>
-      </w:pPr>
-      <w:r>
-        <w:rPr>
-          <w:rFonts w:ascii="Consolas" w:hAnsi="Consolas"/>
-          <w:sz w:val="17"/>
-        </w:rPr>
-        <w:t xml:space="preserve"> [5] HR processes (Confirm / Extend / ...) -------------------&gt; Status: COMPLETED</w:t>
-      </w:r>
-    </w:p>
-    <w:p>
-      <w:pPr>
-        <w:pStyle w:val="NoSpacing"/>
-      </w:pPr>
-      <w:r>
-        <w:rPr>
-          <w:rFonts w:ascii="Consolas" w:hAnsi="Consolas"/>
-          <w:sz w:val="17"/>
-        </w:rPr>
-        <w:t xml:space="preserve">                                                               (probation record set to Confirmed</w:t>
-      </w:r>
-    </w:p>
-    <w:p>
-      <w:pPr>
-        <w:pStyle w:val="NoSpacing"/>
-      </w:pPr>
-      <w:r>
-        <w:rPr>
-          <w:rFonts w:ascii="Consolas" w:hAnsi="Consolas"/>
-          <w:sz w:val="17"/>
-        </w:rPr>
-        <w:t xml:space="preserve">                                                                only at this step)</w:t>
-      </w:r>
-    </w:p>
-    <w:p>
-      <w:pPr>
-        <w:pStyle w:val="NoSpacing"/>
-      </w:pPr>
-      <w:r>
-        <w:rPr>
-          <w:rFonts w:ascii="Consolas" w:hAnsi="Consolas"/>
-          <w:sz w:val="17"/>
-        </w:rPr>
-        <w:t xml:space="preserve"> Any time before HR: employee separates -&gt; CANCELLED</w:t>
+        <w:t>Editable source: `CR-2026-XXX-PEV_Workflow.svg`.</w:t>
       </w:r>
     </w:p>
     <w:tbl>

</xml_diff>